<commit_message>
feat(resume): refine VLA_New page 2 formatting
- Merge publications and news into single anti-chronological list
- Bold only author's name in publications, not co-authors or journalists
- Replace em-dashes with hyphens in awards
- Add 2025 Core Technology Contribution to Defense Partner's Trailblazer Award

Co-Authored-By: Claude Sonnet 4.6 <noreply@anthropic.com>
</commit_message>
<xml_diff>
--- a/Alex_Nettekoven_Resume_Standard_VLA_New.docx
+++ b/Alex_Nettekoven_Resume_Standard_VLA_New.docx
@@ -1516,15 +1516,16 @@
         <w:rPr>
           <w:b/>
           <w:sz w:val="22"/>
-        </w:rPr>
-        <w:t>2024</w:t>
-      </w:r>
-      <w:r>
-        <w:rPr>
-          <w:b w:val="0"/>
-          <w:sz w:val="22"/>
-        </w:rPr>
-        <w:t xml:space="preserve"> — Pentagon Wargaming Development Partnership. Sole-source SBIR Phase III by OUSD A&amp;S and Air Force Autonomy Prime.</w:t>
+          <w:szCs w:val="22"/>
+        </w:rPr>
+        <w:t>2025</w:t>
+      </w:r>
+      <w:r>
+        <w:rPr>
+          <w:sz w:val="22"/>
+          <w:szCs w:val="22"/>
+        </w:rPr>
+        <w:t xml:space="preserve"> - Core Technology Contribution to Defense Partner's Trailblazer Award.</w:t>
       </w:r>
     </w:p>
     <w:p>
@@ -1542,17 +1543,18 @@
       <w:r>
         <w:rPr>
           <w:b/>
-          <w:sz w:val="22"/>
-          <w:szCs w:val="22"/>
-        </w:rPr>
-        <w:t>2021–2024</w:t>
-      </w:r>
-      <w:r>
-        <w:rPr>
-          <w:sz w:val="22"/>
-          <w:szCs w:val="22"/>
-        </w:rPr>
-        <w:t xml:space="preserve"> — Air Force SBIR Phase I/II/III &amp; TACFI. Multiple contracts totaling seven figures from Air Force Agility Prime and AFWERX Ventures.</w:t>
+          <w:i w:val="0"/>
+          <w:sz w:val="22"/>
+        </w:rPr>
+        <w:t>2024</w:t>
+      </w:r>
+      <w:r>
+        <w:rPr>
+          <w:b w:val="0"/>
+          <w:i w:val="0"/>
+          <w:sz w:val="22"/>
+        </w:rPr>
+        <w:t xml:space="preserve"> - Pentagon Wargaming Development Partnership. Sole-source SBIR Phase III by OUSD A&amp;S and Air Force Autonomy Prime.</w:t>
       </w:r>
     </w:p>
     <w:p>
@@ -1570,17 +1572,18 @@
       <w:r>
         <w:rPr>
           <w:b/>
-          <w:sz w:val="22"/>
-          <w:szCs w:val="22"/>
-        </w:rPr>
-        <w:t>2023</w:t>
-      </w:r>
-      <w:r>
-        <w:rPr>
-          <w:sz w:val="22"/>
-          <w:szCs w:val="22"/>
-        </w:rPr>
-        <w:t xml:space="preserve"> — Capital Factory Accelerator. Selected to Texas’s largest and most active startup accelerator.</w:t>
+          <w:i w:val="0"/>
+          <w:sz w:val="22"/>
+        </w:rPr>
+        <w:t>2021-2024</w:t>
+      </w:r>
+      <w:r>
+        <w:rPr>
+          <w:b w:val="0"/>
+          <w:i w:val="0"/>
+          <w:sz w:val="22"/>
+        </w:rPr>
+        <w:t xml:space="preserve"> - Air Force SBIR Phase I/II/III &amp; TACFI. Multiple contracts totaling seven figures from Air Force Agility Prime and AFWERX Ventures.</w:t>
       </w:r>
     </w:p>
     <w:p>
@@ -1598,17 +1601,18 @@
       <w:r>
         <w:rPr>
           <w:b/>
-          <w:sz w:val="22"/>
-          <w:szCs w:val="22"/>
-        </w:rPr>
-        <w:t>2022</w:t>
-      </w:r>
-      <w:r>
-        <w:rPr>
-          <w:sz w:val="22"/>
-          <w:szCs w:val="22"/>
-        </w:rPr>
-        <w:t xml:space="preserve"> — Texas Venture Labs Investment Competition (TVLIC). Five-figure prize; highest commercialization success among Texas student startups.</w:t>
+          <w:i w:val="0"/>
+          <w:sz w:val="22"/>
+        </w:rPr>
+        <w:t>2023</w:t>
+      </w:r>
+      <w:r>
+        <w:rPr>
+          <w:b w:val="0"/>
+          <w:i w:val="0"/>
+          <w:sz w:val="22"/>
+        </w:rPr>
+        <w:t xml:space="preserve"> - Capital Factory Accelerator. Selected to Texas's largest and most active startup accelerator.</w:t>
       </w:r>
     </w:p>
     <w:p>
@@ -1626,17 +1630,18 @@
       <w:r>
         <w:rPr>
           <w:b/>
-          <w:sz w:val="22"/>
-          <w:szCs w:val="22"/>
+          <w:i w:val="0"/>
+          <w:sz w:val="22"/>
         </w:rPr>
         <w:t>2022</w:t>
       </w:r>
       <w:r>
         <w:rPr>
-          <w:sz w:val="22"/>
-          <w:szCs w:val="22"/>
-        </w:rPr>
-        <w:t xml:space="preserve"> — Launch Texas Awardee. UT Austin space entrepreneurship program.</w:t>
+          <w:b w:val="0"/>
+          <w:i w:val="0"/>
+          <w:sz w:val="22"/>
+        </w:rPr>
+        <w:t xml:space="preserve"> - Texas Venture Labs Investment Competition (TVLIC). Five-figure prize; highest commercialization success among Texas student startups.</w:t>
       </w:r>
     </w:p>
     <w:p>
@@ -1654,17 +1659,18 @@
       <w:r>
         <w:rPr>
           <w:b/>
-          <w:sz w:val="22"/>
-          <w:szCs w:val="22"/>
-        </w:rPr>
-        <w:t>2021</w:t>
-      </w:r>
-      <w:r>
-        <w:rPr>
-          <w:sz w:val="22"/>
-          <w:szCs w:val="22"/>
-        </w:rPr>
-        <w:t xml:space="preserve"> — GAIN Mechanical Engineering Award. Outstanding research contributions, UT Austin.</w:t>
+          <w:i w:val="0"/>
+          <w:sz w:val="22"/>
+        </w:rPr>
+        <w:t>2022</w:t>
+      </w:r>
+      <w:r>
+        <w:rPr>
+          <w:b w:val="0"/>
+          <w:i w:val="0"/>
+          <w:sz w:val="22"/>
+        </w:rPr>
+        <w:t xml:space="preserve"> - Launch Texas Awardee. UT Austin space entrepreneurship program.</w:t>
       </w:r>
     </w:p>
     <w:p>
@@ -1682,17 +1688,47 @@
       <w:r>
         <w:rPr>
           <w:b/>
-          <w:sz w:val="22"/>
-          <w:szCs w:val="22"/>
+          <w:i w:val="0"/>
+          <w:sz w:val="22"/>
+        </w:rPr>
+        <w:t>2021</w:t>
+      </w:r>
+      <w:r>
+        <w:rPr>
+          <w:b w:val="0"/>
+          <w:i w:val="0"/>
+          <w:sz w:val="22"/>
+        </w:rPr>
+        <w:t xml:space="preserve"> - GAIN Mechanical Engineering Award. Outstanding research contributions, UT Austin.</w:t>
+      </w:r>
+    </w:p>
+    <w:p>
+      <w:pPr>
+        <w:numPr>
+          <w:ilvl w:val="0"/>
+          <w:numId w:val="3"/>
+        </w:numPr>
+        <w:ind w:left="720" w:hanging="360"/>
+        <w:rPr>
+          <w:sz w:val="22"/>
+          <w:szCs w:val="22"/>
+        </w:rPr>
+      </w:pPr>
+      <w:r>
+        <w:rPr>
+          <w:b/>
+          <w:i w:val="0"/>
+          <w:sz w:val="22"/>
         </w:rPr>
         <w:t>2015</w:t>
       </w:r>
       <w:r>
         <w:rPr>
-          <w:sz w:val="22"/>
-          <w:szCs w:val="22"/>
-        </w:rPr>
-        <w:t xml:space="preserve"> — UROP Award. Undergraduate Research Opportunity Award, University of Michigan &amp; RWTH Aachen.</w:t>
+          <w:b w:val="0"/>
+          <w:i w:val="0"/>
+          <w:sz w:val="22"/>
+        </w:rPr>
+        <w:t xml:space="preserve"> - UROP Award. Undergraduate Research Opportunity Award, University of Michigan &amp; RWTH Aachen.</w:t>
       </w:r>
     </w:p>
     <w:p>
@@ -1741,24 +1777,6 @@
       </w:pPr>
       <w:r>
         <w:rPr>
-          <w:rtl w:val="0"/>
-        </w:rPr>
-      </w:r>
-    </w:p>
-    <w:p>
-      <w:pPr>
-        <w:numPr>
-          <w:ilvl w:val="0"/>
-          <w:numId w:val="3"/>
-        </w:numPr>
-        <w:ind w:left="720" w:hanging="360"/>
-        <w:rPr>
-          <w:sz w:val="22"/>
-          <w:szCs w:val="22"/>
-        </w:rPr>
-      </w:pPr>
-      <w:r>
-        <w:rPr>
           <w:b/>
           <w:i w:val="0"/>
           <w:sz w:val="22"/>
@@ -1776,14 +1794,75 @@
     </w:p>
     <w:p>
       <w:pPr>
-        <w:numPr>
-          <w:ilvl w:val="0"/>
-          <w:numId w:val="3"/>
-        </w:numPr>
-        <w:ind w:left="720" w:hanging="360"/>
-        <w:rPr>
-          <w:sz w:val="22"/>
-          <w:szCs w:val="22"/>
+        <w:rPr>
+          <w:sz w:val="10"/>
+          <w:szCs w:val="10"/>
+        </w:rPr>
+      </w:pPr>
+      <w:r>
+        <w:rPr>
+          <w:sz w:val="22"/>
+          <w:szCs w:val="22"/>
+        </w:rPr>
+        <w:t>Deborah Yao</w:t>
+      </w:r>
+      <w:r>
+        <w:rPr>
+          <w:sz w:val="22"/>
+          <w:szCs w:val="22"/>
+        </w:rPr>
+        <w:t>. “Hybrid AI Reduces Generative AI Hallucinations.” AI Business (09/21/2023).</w:t>
+      </w:r>
+    </w:p>
+    <w:p>
+      <w:pPr>
+        <w:rPr>
+          <w:sz w:val="10"/>
+          <w:szCs w:val="10"/>
+        </w:rPr>
+      </w:pPr>
+      <w:r>
+        <w:rPr>
+          <w:sz w:val="22"/>
+          <w:szCs w:val="22"/>
+        </w:rPr>
+        <w:t>Jeremy R. Dunn</w:t>
+      </w:r>
+      <w:r>
+        <w:rPr>
+          <w:sz w:val="22"/>
+          <w:szCs w:val="22"/>
+        </w:rPr>
+        <w:t>. “Tech Connect partner uses AI to assist in in-theater mission planning.” Defense Visual Information Distribution Service (08/23/2023).</w:t>
+      </w:r>
+    </w:p>
+    <w:p>
+      <w:pPr>
+        <w:rPr>
+          <w:sz w:val="10"/>
+          <w:szCs w:val="10"/>
+        </w:rPr>
+      </w:pPr>
+      <w:r>
+        <w:rPr>
+          <w:sz w:val="22"/>
+          <w:szCs w:val="22"/>
+        </w:rPr>
+        <w:t>Nat Levy</w:t>
+      </w:r>
+      <w:r>
+        <w:rPr>
+          <w:sz w:val="22"/>
+          <w:szCs w:val="22"/>
+        </w:rPr>
+        <w:t>. “Ready for Launch.” Texas Engineer (2022–2023).</w:t>
+      </w:r>
+    </w:p>
+    <w:p>
+      <w:pPr>
+        <w:rPr>
+          <w:sz w:val="10"/>
+          <w:szCs w:val="10"/>
         </w:rPr>
       </w:pPr>
       <w:r>
@@ -1804,23 +1883,25 @@
     </w:p>
     <w:p>
       <w:pPr>
-        <w:numPr>
-          <w:ilvl w:val="0"/>
-          <w:numId w:val="3"/>
-        </w:numPr>
-        <w:ind w:left="720" w:hanging="360"/>
-        <w:rPr>
-          <w:sz w:val="22"/>
-          <w:szCs w:val="22"/>
-        </w:rPr>
-      </w:pPr>
+        <w:rPr>
+          <w:sz w:val="10"/>
+          <w:szCs w:val="10"/>
+        </w:rPr>
+      </w:pPr>
+      <w:r>
+        <w:rPr>
+          <w:sz w:val="22"/>
+          <w:szCs w:val="22"/>
+        </w:rPr>
+        <w:t xml:space="preserve">Zizhao Wang, Xuesu Xiao, </w:t>
+      </w:r>
       <w:r>
         <w:rPr>
           <w:b/>
           <w:sz w:val="22"/>
           <w:szCs w:val="22"/>
         </w:rPr>
-        <w:t>Zizhao Wang, Xuesu Xiao, Alexander J. Nettekoven</w:t>
+        <w:t>Alexander J. Nettekoven</w:t>
       </w:r>
       <w:r>
         <w:rPr>
@@ -1828,94 +1909,6 @@
           <w:szCs w:val="22"/>
         </w:rPr>
         <w:t xml:space="preserve"> et al. “From Agile Ground to Aerial Navigation: Learning from Learned Hallucination.” IROS 2021.</w:t>
-      </w:r>
-    </w:p>
-    <w:p>
-      <w:pPr>
-        <w:numPr>
-          <w:ilvl w:val="0"/>
-          <w:numId w:val="3"/>
-        </w:numPr>
-        <w:ind w:left="720" w:hanging="360"/>
-        <w:rPr>
-          <w:sz w:val="22"/>
-          <w:szCs w:val="22"/>
-          <w:u w:val="none"/>
-        </w:rPr>
-      </w:pPr>
-      <w:r>
-        <w:rPr>
-          <w:b/>
-          <w:i w:val="0"/>
-          <w:sz w:val="22"/>
-        </w:rPr>
-        <w:t>Deborah Yao</w:t>
-      </w:r>
-      <w:r>
-        <w:rPr>
-          <w:b w:val="0"/>
-          <w:i w:val="0"/>
-          <w:sz w:val="22"/>
-        </w:rPr>
-        <w:t>. “Hybrid AI Reduces Generative AI Hallucinations.” AI Business (09/21/2023).</w:t>
-      </w:r>
-    </w:p>
-    <w:p>
-      <w:pPr>
-        <w:numPr>
-          <w:ilvl w:val="0"/>
-          <w:numId w:val="3"/>
-        </w:numPr>
-        <w:ind w:left="720" w:hanging="360"/>
-        <w:rPr>
-          <w:sz w:val="22"/>
-          <w:szCs w:val="22"/>
-          <w:u w:val="none"/>
-        </w:rPr>
-      </w:pPr>
-      <w:r>
-        <w:rPr>
-          <w:b/>
-          <w:sz w:val="22"/>
-          <w:szCs w:val="22"/>
-        </w:rPr>
-        <w:t>Jeremy R. Dunn</w:t>
-      </w:r>
-      <w:r>
-        <w:rPr>
-          <w:sz w:val="22"/>
-          <w:szCs w:val="22"/>
-        </w:rPr>
-        <w:t>. “Tech Connect partner uses AI to assist in in-theater mission planning.” Defense Visual Information Distribution Service (08/23/2023).</w:t>
-      </w:r>
-    </w:p>
-    <w:p>
-      <w:pPr>
-        <w:numPr>
-          <w:ilvl w:val="0"/>
-          <w:numId w:val="3"/>
-        </w:numPr>
-        <w:ind w:left="720" w:hanging="360"/>
-        <w:rPr>
-          <w:sz w:val="22"/>
-          <w:szCs w:val="22"/>
-          <w:u w:val="none"/>
-        </w:rPr>
-      </w:pPr>
-      <w:r>
-        <w:rPr>
-          <w:b/>
-          <w:sz w:val="22"/>
-          <w:szCs w:val="22"/>
-        </w:rPr>
-        <w:t>Nat Levy</w:t>
-      </w:r>
-      <w:r>
-        <w:rPr>
-          <w:sz w:val="22"/>
-          <w:szCs w:val="22"/>
-        </w:rPr>
-        <w:t>. “Ready for Launch.” Texas Engineer (2022–2023).</w:t>
       </w:r>
     </w:p>
     <w:p>

</xml_diff>

<commit_message>
feat(resume): further refine VLA_New awards and publications
- Add bullet points to Selected Publications & News
- Capital Factory: "largest and most active" -> "most prestigious"
- Texas Venture Labs: remove price figure and acronym
- Remove UROP award

Co-Authored-By: Claude Sonnet 4.6 <noreply@anthropic.com>
</commit_message>
<xml_diff>
--- a/Alex_Nettekoven_Resume_Standard_VLA_New.docx
+++ b/Alex_Nettekoven_Resume_Standard_VLA_New.docx
@@ -1612,7 +1612,7 @@
           <w:i w:val="0"/>
           <w:sz w:val="22"/>
         </w:rPr>
-        <w:t xml:space="preserve"> - Capital Factory Accelerator. Selected to Texas's largest and most active startup accelerator.</w:t>
+        <w:t xml:space="preserve"> - Capital Factory Accelerator. Selected to Texas's most prestigious startup accelerator.</w:t>
       </w:r>
     </w:p>
     <w:p>
@@ -1641,7 +1641,7 @@
           <w:i w:val="0"/>
           <w:sz w:val="22"/>
         </w:rPr>
-        <w:t xml:space="preserve"> - Texas Venture Labs Investment Competition (TVLIC). Five-figure prize; highest commercialization success among Texas student startups.</w:t>
+        <w:t xml:space="preserve"> - Texas Venture Labs Investment Competition. Highest commercialization success among Texas student startups.</w:t>
       </w:r>
     </w:p>
     <w:p>
@@ -1700,35 +1700,6 @@
           <w:sz w:val="22"/>
         </w:rPr>
         <w:t xml:space="preserve"> - GAIN Mechanical Engineering Award. Outstanding research contributions, UT Austin.</w:t>
-      </w:r>
-    </w:p>
-    <w:p>
-      <w:pPr>
-        <w:numPr>
-          <w:ilvl w:val="0"/>
-          <w:numId w:val="3"/>
-        </w:numPr>
-        <w:ind w:left="720" w:hanging="360"/>
-        <w:rPr>
-          <w:sz w:val="22"/>
-          <w:szCs w:val="22"/>
-        </w:rPr>
-      </w:pPr>
-      <w:r>
-        <w:rPr>
-          <w:b/>
-          <w:i w:val="0"/>
-          <w:sz w:val="22"/>
-        </w:rPr>
-        <w:t>2015</w:t>
-      </w:r>
-      <w:r>
-        <w:rPr>
-          <w:b w:val="0"/>
-          <w:i w:val="0"/>
-          <w:sz w:val="22"/>
-        </w:rPr>
-        <w:t xml:space="preserve"> - UROP Award. Undergraduate Research Opportunity Award, University of Michigan &amp; RWTH Aachen.</w:t>
       </w:r>
     </w:p>
     <w:p>
@@ -1770,10 +1741,15 @@
     </w:p>
     <w:p>
       <w:pPr>
-        <w:rPr>
-          <w:sz w:val="10"/>
-          <w:szCs w:val="10"/>
-        </w:rPr>
+        <w:numPr>
+          <w:ilvl w:val="0"/>
+          <w:numId w:val="3"/>
+        </w:numPr>
+        <w:rPr>
+          <w:sz w:val="22"/>
+          <w:szCs w:val="22"/>
+        </w:rPr>
+        <w:ind w:left="720" w:hanging="360"/>
       </w:pPr>
       <w:r>
         <w:rPr>
@@ -1794,10 +1770,15 @@
     </w:p>
     <w:p>
       <w:pPr>
-        <w:rPr>
-          <w:sz w:val="10"/>
-          <w:szCs w:val="10"/>
-        </w:rPr>
+        <w:numPr>
+          <w:ilvl w:val="0"/>
+          <w:numId w:val="3"/>
+        </w:numPr>
+        <w:rPr>
+          <w:sz w:val="22"/>
+          <w:szCs w:val="22"/>
+        </w:rPr>
+        <w:ind w:left="720" w:hanging="360"/>
       </w:pPr>
       <w:r>
         <w:rPr>
@@ -1816,10 +1797,15 @@
     </w:p>
     <w:p>
       <w:pPr>
-        <w:rPr>
-          <w:sz w:val="10"/>
-          <w:szCs w:val="10"/>
-        </w:rPr>
+        <w:numPr>
+          <w:ilvl w:val="0"/>
+          <w:numId w:val="3"/>
+        </w:numPr>
+        <w:rPr>
+          <w:sz w:val="22"/>
+          <w:szCs w:val="22"/>
+        </w:rPr>
+        <w:ind w:left="720" w:hanging="360"/>
       </w:pPr>
       <w:r>
         <w:rPr>
@@ -1838,10 +1824,15 @@
     </w:p>
     <w:p>
       <w:pPr>
-        <w:rPr>
-          <w:sz w:val="10"/>
-          <w:szCs w:val="10"/>
-        </w:rPr>
+        <w:numPr>
+          <w:ilvl w:val="0"/>
+          <w:numId w:val="3"/>
+        </w:numPr>
+        <w:rPr>
+          <w:sz w:val="22"/>
+          <w:szCs w:val="22"/>
+        </w:rPr>
+        <w:ind w:left="720" w:hanging="360"/>
       </w:pPr>
       <w:r>
         <w:rPr>
@@ -1860,10 +1851,15 @@
     </w:p>
     <w:p>
       <w:pPr>
-        <w:rPr>
-          <w:sz w:val="10"/>
-          <w:szCs w:val="10"/>
-        </w:rPr>
+        <w:numPr>
+          <w:ilvl w:val="0"/>
+          <w:numId w:val="3"/>
+        </w:numPr>
+        <w:rPr>
+          <w:sz w:val="22"/>
+          <w:szCs w:val="22"/>
+        </w:rPr>
+        <w:ind w:left="720" w:hanging="360"/>
       </w:pPr>
       <w:r>
         <w:rPr>
@@ -1883,10 +1879,15 @@
     </w:p>
     <w:p>
       <w:pPr>
-        <w:rPr>
-          <w:sz w:val="10"/>
-          <w:szCs w:val="10"/>
-        </w:rPr>
+        <w:numPr>
+          <w:ilvl w:val="0"/>
+          <w:numId w:val="3"/>
+        </w:numPr>
+        <w:rPr>
+          <w:sz w:val="22"/>
+          <w:szCs w:val="22"/>
+        </w:rPr>
+        <w:ind w:left="720" w:hanging="360"/>
       </w:pPr>
       <w:r>
         <w:rPr>

</xml_diff>

<commit_message>
feat(resume): expand awards section and refine wording
- Add Texas AI Caucus (2024), Bridge-to-Phase II (2022), and Elite
  Startup Accelerators/MassChallenge (2022) awards
- Update Launch Texas to CV wording
- Rename Texas Venture Labs entry; remove price figure and explainer
- Capital Factory: "most prestigious" -> "prestigious"

Co-Authored-By: Claude Sonnet 4.6 <noreply@anthropic.com>
</commit_message>
<xml_diff>
--- a/Alex_Nettekoven_Resume_Standard_VLA_New.docx
+++ b/Alex_Nettekoven_Resume_Standard_VLA_New.docx
@@ -1572,6 +1572,34 @@
       <w:r>
         <w:rPr>
           <w:b/>
+          <w:sz w:val="22"/>
+          <w:szCs w:val="22"/>
+        </w:rPr>
+        <w:t>2024</w:t>
+      </w:r>
+      <w:r>
+        <w:rPr>
+          <w:sz w:val="22"/>
+          <w:szCs w:val="22"/>
+        </w:rPr>
+        <w:t xml:space="preserve"> - Invited Expert to Texas AI Caucus. Advised Texas State Representative on AI policy and commercial regulations.</w:t>
+      </w:r>
+    </w:p>
+    <w:p>
+      <w:pPr>
+        <w:numPr>
+          <w:ilvl w:val="0"/>
+          <w:numId w:val="3"/>
+        </w:numPr>
+        <w:ind w:left="720" w:hanging="360"/>
+        <w:rPr>
+          <w:sz w:val="22"/>
+          <w:szCs w:val="22"/>
+        </w:rPr>
+      </w:pPr>
+      <w:r>
+        <w:rPr>
+          <w:b/>
           <w:i w:val="0"/>
           <w:sz w:val="22"/>
         </w:rPr>
@@ -1612,7 +1640,34 @@
           <w:i w:val="0"/>
           <w:sz w:val="22"/>
         </w:rPr>
-        <w:t xml:space="preserve"> - Capital Factory Accelerator. Selected to Texas's most prestigious startup accelerator.</w:t>
+        <w:t xml:space="preserve"> - Capital Factory Accelerator. Selected to Texas's prestigious startup accelerator.</w:t>
+      </w:r>
+    </w:p>
+    <w:p>
+      <w:pPr>
+        <w:numPr>
+          <w:ilvl w:val="0"/>
+          <w:numId w:val="3"/>
+        </w:numPr>
+        <w:ind w:left="720" w:hanging="360"/>
+        <w:rPr>
+          <w:sz w:val="22"/>
+          <w:szCs w:val="22"/>
+        </w:rPr>
+      </w:pPr>
+      <w:r>
+        <w:rPr>
+          <w:b/>
+          <w:sz w:val="22"/>
+        </w:rPr>
+        <w:t>2022</w:t>
+      </w:r>
+      <w:r>
+        <w:rPr>
+          <w:b w:val="0"/>
+          <w:sz w:val="22"/>
+        </w:rPr>
+        <w:t xml:space="preserve"> - Texas Venture Labs Investment Competition Commercialization Winner.</w:t>
       </w:r>
     </w:p>
     <w:p>
@@ -1641,7 +1696,7 @@
           <w:i w:val="0"/>
           <w:sz w:val="22"/>
         </w:rPr>
-        <w:t xml:space="preserve"> - Texas Venture Labs Investment Competition. Highest commercialization success among Texas student startups.</w:t>
+        <w:t xml:space="preserve"> - Launch Texas Awardee. Newly-founded space entrepreneurship program at UT Austin.</w:t>
       </w:r>
     </w:p>
     <w:p>
@@ -1659,18 +1714,45 @@
       <w:r>
         <w:rPr>
           <w:b/>
-          <w:i w:val="0"/>
-          <w:sz w:val="22"/>
+          <w:sz w:val="22"/>
+          <w:szCs w:val="22"/>
         </w:rPr>
         <w:t>2022</w:t>
       </w:r>
       <w:r>
         <w:rPr>
-          <w:b w:val="0"/>
-          <w:i w:val="0"/>
-          <w:sz w:val="22"/>
-        </w:rPr>
-        <w:t xml:space="preserve"> - Launch Texas Awardee. UT Austin space entrepreneurship program.</w:t>
+          <w:sz w:val="22"/>
+          <w:szCs w:val="22"/>
+        </w:rPr>
+        <w:t xml:space="preserve"> - Bridge-to-Phase II Award Winner. UT Discovery grant for national security AI.</w:t>
+      </w:r>
+    </w:p>
+    <w:p>
+      <w:pPr>
+        <w:numPr>
+          <w:ilvl w:val="0"/>
+          <w:numId w:val="3"/>
+        </w:numPr>
+        <w:ind w:left="720" w:hanging="360"/>
+        <w:rPr>
+          <w:sz w:val="22"/>
+          <w:szCs w:val="22"/>
+        </w:rPr>
+      </w:pPr>
+      <w:r>
+        <w:rPr>
+          <w:b/>
+          <w:sz w:val="22"/>
+          <w:szCs w:val="22"/>
+        </w:rPr>
+        <w:t>2022</w:t>
+      </w:r>
+      <w:r>
+        <w:rPr>
+          <w:sz w:val="22"/>
+          <w:szCs w:val="22"/>
+        </w:rPr>
+        <w:t xml:space="preserve"> - Selection for Elite Startup Accelerators. MassChallenge finalist (out of 400 startups) and Air Force Technology Acceleration Program.</w:t>
       </w:r>
     </w:p>
     <w:p>

</xml_diff>

<commit_message>
feat(resume): tighten awards wording and reformat news entries
- SBIR: remove funding detail, append "Award"
- Launch Texas: combine into single sentence with "for"
- Texas AI Caucus: combine into single sentence
- News entries: lead with bold journal name + "about Multi AI", then title by author

Co-Authored-By: Claude Sonnet 4.6 <noreply@anthropic.com>
</commit_message>
<xml_diff>
--- a/Alex_Nettekoven_Resume_Standard_VLA_New.docx
+++ b/Alex_Nettekoven_Resume_Standard_VLA_New.docx
@@ -1573,16 +1573,42 @@
         <w:rPr>
           <w:b/>
           <w:sz w:val="22"/>
-          <w:szCs w:val="22"/>
         </w:rPr>
         <w:t>2024</w:t>
       </w:r>
       <w:r>
         <w:rPr>
-          <w:sz w:val="22"/>
-          <w:szCs w:val="22"/>
-        </w:rPr>
-        <w:t xml:space="preserve"> - Invited Expert to Texas AI Caucus. Advised Texas State Representative on AI policy and commercial regulations.</w:t>
+          <w:b w:val="0"/>
+          <w:sz w:val="22"/>
+        </w:rPr>
+        <w:t xml:space="preserve"> - Invited Expert to Texas AI Caucus to advise Texas State Representative on AI policy.</w:t>
+      </w:r>
+    </w:p>
+    <w:p>
+      <w:pPr>
+        <w:numPr>
+          <w:ilvl w:val="0"/>
+          <w:numId w:val="3"/>
+        </w:numPr>
+        <w:ind w:left="720" w:hanging="360"/>
+        <w:rPr>
+          <w:sz w:val="22"/>
+          <w:szCs w:val="22"/>
+        </w:rPr>
+      </w:pPr>
+      <w:r>
+        <w:rPr>
+          <w:b/>
+          <w:sz w:val="22"/>
+        </w:rPr>
+        <w:t>2021-2024</w:t>
+      </w:r>
+      <w:r>
+        <w:rPr>
+          <w:b w:val="0"/>
+          <w:sz w:val="22"/>
+        </w:rPr>
+        <w:t xml:space="preserve"> - Air Force SBIR Phase I/II/III &amp; TACFI Award.</w:t>
       </w:r>
     </w:p>
     <w:p>
@@ -1603,7 +1629,7 @@
           <w:i w:val="0"/>
           <w:sz w:val="22"/>
         </w:rPr>
-        <w:t>2021-2024</w:t>
+        <w:t>2023</w:t>
       </w:r>
       <w:r>
         <w:rPr>
@@ -1611,7 +1637,7 @@
           <w:i w:val="0"/>
           <w:sz w:val="22"/>
         </w:rPr>
-        <w:t xml:space="preserve"> - Air Force SBIR Phase I/II/III &amp; TACFI. Multiple contracts totaling seven figures from Air Force Agility Prime and AFWERX Ventures.</w:t>
+        <w:t xml:space="preserve"> - Capital Factory Accelerator. Selected to Texas's prestigious startup accelerator.</w:t>
       </w:r>
     </w:p>
     <w:p>
@@ -1629,18 +1655,16 @@
       <w:r>
         <w:rPr>
           <w:b/>
-          <w:i w:val="0"/>
-          <w:sz w:val="22"/>
-        </w:rPr>
-        <w:t>2023</w:t>
+          <w:sz w:val="22"/>
+        </w:rPr>
+        <w:t>2022</w:t>
       </w:r>
       <w:r>
         <w:rPr>
           <w:b w:val="0"/>
-          <w:i w:val="0"/>
-          <w:sz w:val="22"/>
-        </w:rPr>
-        <w:t xml:space="preserve"> - Capital Factory Accelerator. Selected to Texas's prestigious startup accelerator.</w:t>
+          <w:sz w:val="22"/>
+        </w:rPr>
+        <w:t xml:space="preserve"> - Texas Venture Labs Investment Competition Commercialization Winner.</w:t>
       </w:r>
     </w:p>
     <w:p>
@@ -1667,36 +1691,7 @@
           <w:b w:val="0"/>
           <w:sz w:val="22"/>
         </w:rPr>
-        <w:t xml:space="preserve"> - Texas Venture Labs Investment Competition Commercialization Winner.</w:t>
-      </w:r>
-    </w:p>
-    <w:p>
-      <w:pPr>
-        <w:numPr>
-          <w:ilvl w:val="0"/>
-          <w:numId w:val="3"/>
-        </w:numPr>
-        <w:ind w:left="720" w:hanging="360"/>
-        <w:rPr>
-          <w:sz w:val="22"/>
-          <w:szCs w:val="22"/>
-        </w:rPr>
-      </w:pPr>
-      <w:r>
-        <w:rPr>
-          <w:b/>
-          <w:i w:val="0"/>
-          <w:sz w:val="22"/>
-        </w:rPr>
-        <w:t>2022</w:t>
-      </w:r>
-      <w:r>
-        <w:rPr>
-          <w:b w:val="0"/>
-          <w:i w:val="0"/>
-          <w:sz w:val="22"/>
-        </w:rPr>
-        <w:t xml:space="preserve"> - Launch Texas Awardee. Newly-founded space entrepreneurship program at UT Austin.</w:t>
+        <w:t xml:space="preserve"> - Launch Texas Awardee for UT Austin's space entrepreneurship program.</w:t>
       </w:r>
     </w:p>
     <w:p>
@@ -1864,17 +1859,17 @@
       </w:pPr>
       <w:r>
         <w:rPr>
-          <w:sz w:val="22"/>
-          <w:szCs w:val="22"/>
-        </w:rPr>
-        <w:t>Deborah Yao</w:t>
-      </w:r>
-      <w:r>
-        <w:rPr>
-          <w:sz w:val="22"/>
-          <w:szCs w:val="22"/>
-        </w:rPr>
-        <w:t>. “Hybrid AI Reduces Generative AI Hallucinations.” AI Business (09/21/2023).</w:t>
+          <w:b/>
+          <w:sz w:val="22"/>
+        </w:rPr>
+        <w:t>AI Business</w:t>
+      </w:r>
+      <w:r>
+        <w:rPr>
+          <w:b w:val="0"/>
+          <w:sz w:val="22"/>
+        </w:rPr>
+        <w:t xml:space="preserve"> about Multi AI. “Hybrid AI Reduces Generative AI Hallucinations” by Deborah Yao (09/21/2023).</w:t>
       </w:r>
     </w:p>
     <w:p>
@@ -1891,17 +1886,17 @@
       </w:pPr>
       <w:r>
         <w:rPr>
-          <w:sz w:val="22"/>
-          <w:szCs w:val="22"/>
-        </w:rPr>
-        <w:t>Jeremy R. Dunn</w:t>
-      </w:r>
-      <w:r>
-        <w:rPr>
-          <w:sz w:val="22"/>
-          <w:szCs w:val="22"/>
-        </w:rPr>
-        <w:t>. “Tech Connect partner uses AI to assist in in-theater mission planning.” Defense Visual Information Distribution Service (08/23/2023).</w:t>
+          <w:b/>
+          <w:sz w:val="22"/>
+        </w:rPr>
+        <w:t>Defense Visual Information Distribution Service</w:t>
+      </w:r>
+      <w:r>
+        <w:rPr>
+          <w:b w:val="0"/>
+          <w:sz w:val="22"/>
+        </w:rPr>
+        <w:t xml:space="preserve"> about Multi AI. “Tech Connect partner uses AI to assist in in-theater mission planning” by Jeremy R. Dunn (08/23/2023).</w:t>
       </w:r>
     </w:p>
     <w:p>
@@ -1918,17 +1913,17 @@
       </w:pPr>
       <w:r>
         <w:rPr>
-          <w:sz w:val="22"/>
-          <w:szCs w:val="22"/>
-        </w:rPr>
-        <w:t>Nat Levy</w:t>
-      </w:r>
-      <w:r>
-        <w:rPr>
-          <w:sz w:val="22"/>
-          <w:szCs w:val="22"/>
-        </w:rPr>
-        <w:t>. “Ready for Launch.” Texas Engineer (2022–2023).</w:t>
+          <w:b/>
+          <w:sz w:val="22"/>
+        </w:rPr>
+        <w:t>Texas Engineer</w:t>
+      </w:r>
+      <w:r>
+        <w:rPr>
+          <w:b w:val="0"/>
+          <w:sz w:val="22"/>
+        </w:rPr>
+        <w:t xml:space="preserve"> about Multi AI. “Ready for Launch” by Nat Levy (2022–2023).</w:t>
       </w:r>
     </w:p>
     <w:p>

</xml_diff>

<commit_message>
fix(resume): add missing spacer paragraph under Selected Publications header
Co-Authored-By: Claude Sonnet 4.6 <noreply@anthropic.com>
</commit_message>
<xml_diff>
--- a/Alex_Nettekoven_Resume_Standard_VLA_New.docx
+++ b/Alex_Nettekoven_Resume_Standard_VLA_New.docx
@@ -1810,6 +1810,19 @@
         </w:rPr>
         <w:t xml:space="preserve">SELECTED PUBLICATIONS &amp; NEWS</w:t>
       </w:r>
+      <w:r>
+        <w:rPr>
+          <w:rtl w:val="0"/>
+        </w:rPr>
+      </w:r>
+    </w:p>
+    <w:p>
+      <w:pPr>
+        <w:rPr>
+          <w:sz w:val="10"/>
+          <w:szCs w:val="10"/>
+        </w:rPr>
+      </w:pPr>
       <w:r>
         <w:rPr>
           <w:rtl w:val="0"/>

</xml_diff>

<commit_message>
fix(resume): shorten awards and remove references to fit 2 pages
Remove 'Major Air Force Program Support.' title prefix, simplify
MassChallenge entry by removing leading sentence, and drop the
References line from Additional Information.

Co-Authored-By: Claude Sonnet 4.6 <noreply@anthropic.com>
</commit_message>
<xml_diff>
--- a/Alex_Nettekoven_Resume_Standard_VLA_New.docx
+++ b/Alex_Nettekoven_Resume_Standard_VLA_New.docx
@@ -1518,6 +1518,34 @@
           <w:sz w:val="22"/>
           <w:szCs w:val="22"/>
         </w:rPr>
+        <w:t>2021-2025</w:t>
+      </w:r>
+      <w:r>
+        <w:rPr>
+          <w:sz w:val="22"/>
+          <w:szCs w:val="22"/>
+        </w:rPr>
+        <w:t xml:space="preserve"> - Formal endorsement from Air Force AFWERX, AFRL Autonomy Capability Team 3 (ACT3), AFRL/RQ Aerospace Systems Directorate, AFRL/RISB, Textron Systems, 492d &amp; 494th Fighter Generation Squadrons (48th Operations Group), AFLCMC/WLQ Technology Development Branch, and USTRANSCOM TCJ5/4.</w:t>
+      </w:r>
+    </w:p>
+    <w:p>
+      <w:pPr>
+        <w:numPr>
+          <w:ilvl w:val="0"/>
+          <w:numId w:val="3"/>
+        </w:numPr>
+        <w:ind w:left="720" w:hanging="360"/>
+        <w:rPr>
+          <w:sz w:val="22"/>
+          <w:szCs w:val="22"/>
+        </w:rPr>
+      </w:pPr>
+      <w:r>
+        <w:rPr>
+          <w:b/>
+          <w:sz w:val="22"/>
+          <w:szCs w:val="22"/>
+        </w:rPr>
         <w:t>2025</w:t>
       </w:r>
       <w:r>
@@ -1747,7 +1775,7 @@
           <w:sz w:val="22"/>
           <w:szCs w:val="22"/>
         </w:rPr>
-        <w:t xml:space="preserve"> - Selection for Elite Startup Accelerators. MassChallenge finalist (out of 400 startups) and Air Force Technology Acceleration Program.</w:t>
+        <w:t xml:space="preserve"> - MassChallenge Finalist (out of 400 startups) and Air Force Technology Acceleration Program.</w:t>
       </w:r>
     </w:p>
     <w:p>
@@ -2063,48 +2091,6 @@
           <w:rtl w:val="0"/>
         </w:rPr>
         <w:t xml:space="preserve">Peer Reviewer: ICRA, IROS, IEEE RA-L (2021-present)</w:t>
-      </w:r>
-    </w:p>
-    <w:p>
-      <w:pPr>
-        <w:numPr>
-          <w:ilvl w:val="0"/>
-          <w:numId w:val="3"/>
-        </w:numPr>
-        <w:ind w:left="720" w:hanging="360"/>
-        <w:rPr>
-          <w:sz w:val="22"/>
-          <w:szCs w:val="22"/>
-          <w:u w:val="none"/>
-        </w:rPr>
-      </w:pPr>
-      <w:r>
-        <w:rPr>
-          <w:sz w:val="22"/>
-          <w:szCs w:val="22"/>
-          <w:rtl w:val="0"/>
-        </w:rPr>
-        <w:t xml:space="preserve">References: </w:t>
-      </w:r>
-      <w:hyperlink r:id="rId9">
-        <w:r>
-          <w:rPr>
-            <w:color w:val="1155cc"/>
-            <w:sz w:val="22"/>
-            <w:szCs w:val="22"/>
-            <w:u w:val="single"/>
-            <w:rtl w:val="0"/>
-          </w:rPr>
-          <w:t xml:space="preserve">utopcu@utexas.edu</w:t>
-        </w:r>
-      </w:hyperlink>
-      <w:r>
-        <w:rPr>
-          <w:sz w:val="22"/>
-          <w:szCs w:val="22"/>
-          <w:rtl w:val="0"/>
-        </w:rPr>
-        <w:t xml:space="preserve">. Additional references upon request.</w:t>
       </w:r>
     </w:p>
     <w:p>

</xml_diff>

<commit_message>
feat(resume): expand AFWERX to Agility Prime and Autonomy Prime
Co-Authored-By: Claude Sonnet 4.6 <noreply@anthropic.com>
</commit_message>
<xml_diff>
--- a/Alex_Nettekoven_Resume_Standard_VLA_New.docx
+++ b/Alex_Nettekoven_Resume_Standard_VLA_New.docx
@@ -1525,7 +1525,7 @@
           <w:sz w:val="22"/>
           <w:szCs w:val="22"/>
         </w:rPr>
-        <w:t xml:space="preserve"> - Formal endorsement from Air Force AFWERX, AFRL Autonomy Capability Team 3 (ACT3), AFRL/RQ Aerospace Systems Directorate, AFRL/RISB, Textron Systems, 492d &amp; 494th Fighter Generation Squadrons (48th Operations Group), AFLCMC/WLQ Technology Development Branch, and USTRANSCOM TCJ5/4.</w:t>
+        <w:t xml:space="preserve"> - Formal endorsement from Air Force AFWERX Agility Prime and Autonomy Prime, AFRL Autonomy Capability Team 3 (ACT3), AFRL/RQ Aerospace Systems Directorate, AFRL/RISB, Textron Systems, 492d &amp; 494th Fighter Generation Squadrons (48th Operations Group), AFLCMC/WLQ Technology Development Branch, and USTRANSCOM TCJ5/4.</w:t>
       </w:r>
     </w:p>
     <w:p>
@@ -1883,7 +1883,7 @@
           <w:i w:val="0"/>
           <w:sz w:val="22"/>
         </w:rPr>
-        <w:t>, Matthew Carlin &amp; Ufuk Topcu. “Agile Combat Employment System (ACES) Model Modifications.” Technical Report, US Air Force AFWERX SBIR Phase III (2024).</w:t>
+        <w:t>, Matthew Carlin &amp; Ufuk Topcu. “Agile Combat Employment System (ACES) Model Modifications.” Technical Report, US Air Force AFWERX Agility Prime and Autonomy Prime SBIR Phase III (2024).</w:t>
       </w:r>
     </w:p>
     <w:p>

</xml_diff>

<commit_message>
fix(resume): move defense primes to end, shorten AFWERX citation
Co-Authored-By: Claude Sonnet 4.6 <noreply@anthropic.com>
</commit_message>
<xml_diff>
--- a/Alex_Nettekoven_Resume_Standard_VLA_New.docx
+++ b/Alex_Nettekoven_Resume_Standard_VLA_New.docx
@@ -1525,7 +1525,7 @@
           <w:sz w:val="22"/>
           <w:szCs w:val="22"/>
         </w:rPr>
-        <w:t xml:space="preserve"> - Formal endorsement from Air Force AFWERX Agility Prime and Autonomy Prime, AFRL Autonomy Capability Team 3 (ACT3), AFRL/RQ Aerospace Systems Directorate, AFRL/RISB, defense primes, such as Textron Systems, 492d &amp; 494th Fighter Generation Squadrons (48th Operations Group), AFLCMC/WLQ Technology Development Branch, and USTRANSCOM TCJ5/4.</w:t>
+        <w:t xml:space="preserve"> - Formal endorsement from Air Force AFWERX Agility Prime and Autonomy Prime, AFRL Autonomy Capability Team 3 (ACT3), AFRL/RQ Aerospace Systems Directorate, AFRL/RISB, 492d &amp; 494th Fighter Generation Squadrons (48th Operations Group), AFLCMC/WLQ Technology Development Branch, and USTRANSCOM TCJ5/4, and defense primes such as Textron Systems.</w:t>
       </w:r>
     </w:p>
     <w:p>
@@ -1883,7 +1883,7 @@
           <w:i w:val="0"/>
           <w:sz w:val="22"/>
         </w:rPr>
-        <w:t>, Matthew Carlin &amp; Ufuk Topcu. “Agile Combat Employment System (ACES) Model Modifications.” Technical Report, US Air Force AFWERX Agility Prime and Autonomy Prime SBIR Phase III (2024).</w:t>
+        <w:t>, Matthew Carlin &amp; Ufuk Topcu. “Agile Combat Employment System (ACES) Model Modifications.” Technical Report, US Air Force AFWERX Autonomy Prime SBIR Phase III (2024).</w:t>
       </w:r>
     </w:p>
     <w:p>

</xml_diff>